<commit_message>
docs: add extra details on Figma design and branding in documentation
</commit_message>
<xml_diff>
--- a/public/Muddy — Hackathon Documentation.docx
+++ b/public/Muddy — Hackathon Documentation.docx
@@ -228,19 +228,7 @@
           <w:rPr>
             <w:rStyle w:val="Hyperlink"/>
           </w:rPr>
-          <w:t>Research on slide-linked confus</w:t>
-        </w:r>
-        <w:r>
-          <w:rPr>
-            <w:rStyle w:val="Hyperlink"/>
-          </w:rPr>
-          <w:t>i</w:t>
-        </w:r>
-        <w:r>
-          <w:rPr>
-            <w:rStyle w:val="Hyperlink"/>
-          </w:rPr>
-          <w:t>on feedback</w:t>
+          <w:t>Research on slide-linked confusion feedback</w:t>
         </w:r>
       </w:hyperlink>
       <w:r>
@@ -946,13 +934,209 @@
         <w:t xml:space="preserve"> Unit checks cover the confusion math, including repeat taps, expired taps and "got it." A simulator script signs in 20 anonymous students that send real events and get lost on chosen hard slides, and a database seed function generates a realistic 52-minute lecture for the report.</w:t>
       </w:r>
     </w:p>
+    <w:p>
+      <w:pPr>
+        <w:pStyle w:val="Heading2"/>
+      </w:pPr>
+      <w:r>
+        <w:t>Extra details: Figma design</w:t>
+      </w:r>
+    </w:p>
+    <w:p>
+      <w:pPr>
+        <w:rPr>
+          <w:color w:val="000000"/>
+        </w:rPr>
+      </w:pPr>
+      <w:r>
+        <w:rPr>
+          <w:color w:val="000000"/>
+        </w:rPr>
+        <w:t>The brand and every screen were designed in Figma before they were built, in a light UI that uses one palette across the instructor and student views.</w:t>
+      </w:r>
+    </w:p>
+    <w:p>
+      <w:pPr>
+        <w:rPr>
+          <w:color w:val="000000"/>
+        </w:rPr>
+      </w:pPr>
+      <w:r>
+        <w:rPr>
+          <w:b/>
+          <w:color w:val="000000"/>
+        </w:rPr>
+        <w:t>Brand and logo.</w:t>
+      </w:r>
+      <w:r>
+        <w:rPr>
+          <w:color w:val="000000"/>
+        </w:rPr>
+        <w:t xml:space="preserve"> Four logo directions were explored on one palette: charcoal #262626, sage #ACBFA4, pale green #E2E8CE, tangerine #FF7F11 and red #FF1B1C. The concepts are Drop &amp; Ripple (a tap is a drop hitting the puddle, with the red center where confusion is strongest), Rising m (two arches heating from tangerine to red, the same heat scale used in the app), Muddy Bubble (a dripping speech bubble that stays readable at favicon size) and Puddle (a soft serif wordmark that nods to the muddiest-point technique).</w:t>
+      </w:r>
+    </w:p>
+    <w:p>
+      <w:pPr>
+        <w:rPr>
+          <w:color w:val="000000"/>
+        </w:rPr>
+      </w:pPr>
+      <w:r>
+        <w:rPr>
+          <w:b/>
+          <w:color w:val="000000"/>
+        </w:rPr>
+        <w:t>Type and components.</w:t>
+      </w:r>
+      <w:r>
+        <w:rPr>
+          <w:color w:val="000000"/>
+        </w:rPr>
+        <w:t xml:space="preserve"> Headings use Bricolage Grotesque and interface text uses IBM Plex Sans. A </w:t>
+      </w:r>
+      <w:proofErr w:type="gramStart"/>
+      <w:r>
+        <w:rPr>
+          <w:color w:val="000000"/>
+        </w:rPr>
+        <w:t>small shared</w:t>
+      </w:r>
+      <w:proofErr w:type="gramEnd"/>
+      <w:r>
+        <w:rPr>
+          <w:color w:val="000000"/>
+        </w:rPr>
+        <w:t xml:space="preserve"> component set (buttons in three states) keeps both views consistent.</w:t>
+      </w:r>
+    </w:p>
+    <w:p>
+      <w:pPr>
+        <w:rPr>
+          <w:color w:val="000000"/>
+        </w:rPr>
+      </w:pPr>
+      <w:r>
+        <w:rPr>
+          <w:b/>
+          <w:color w:val="000000"/>
+        </w:rPr>
+        <w:t>Instructor screens.</w:t>
+      </w:r>
+      <w:r>
+        <w:rPr>
+          <w:color w:val="000000"/>
+        </w:rPr>
+        <w:t xml:space="preserve"> Setup (course, lecture title, slide PDF and the 25%, 35% or 50% alert level), Lobby for the projector (4-letter room code, QR code and a live join count), Presenting with the "Lost now" gauge, </w:t>
+      </w:r>
+      <w:proofErr w:type="gramStart"/>
+      <w:r>
+        <w:rPr>
+          <w:color w:val="000000"/>
+        </w:rPr>
+        <w:t>Presenting</w:t>
+      </w:r>
+      <w:proofErr w:type="gramEnd"/>
+      <w:r>
+        <w:rPr>
+          <w:color w:val="000000"/>
+        </w:rPr>
+        <w:t xml:space="preserve"> with the pulse and "38% lost on slide 12" alert, and the Report with its "Start here next time" takeaway and lecture timeline.</w:t>
+      </w:r>
+    </w:p>
+    <w:p>
+      <w:pPr>
+        <w:rPr>
+          <w:color w:val="000000"/>
+        </w:rPr>
+      </w:pPr>
+      <w:r>
+        <w:rPr>
+          <w:b/>
+          <w:color w:val="000000"/>
+        </w:rPr>
+        <w:lastRenderedPageBreak/>
+        <w:t>Student screens.</w:t>
+      </w:r>
+      <w:r>
+        <w:rPr>
+          <w:color w:val="000000"/>
+        </w:rPr>
+        <w:t xml:space="preserve"> Join (enter the room code, no name asked), Welcome (how it works in three lines), Room with the current slide and the "I'm lost" button, Room after a tap with the countdown until it clears, and Session ended listing the three muddiest slides to review.</w:t>
+      </w:r>
+    </w:p>
+    <w:p>
+      <w:pPr>
+        <w:rPr>
+          <w:color w:val="000000"/>
+        </w:rPr>
+      </w:pPr>
+      <w:r>
+        <w:rPr>
+          <w:b/>
+          <w:color w:val="000000"/>
+        </w:rPr>
+        <w:t>Figma files:</w:t>
+      </w:r>
+      <w:r>
+        <w:rPr>
+          <w:color w:val="000000"/>
+        </w:rPr>
+        <w:t xml:space="preserve"> </w:t>
+      </w:r>
+      <w:hyperlink r:id="rId9" w:history="1">
+        <w:r>
+          <w:rPr>
+            <w:rStyle w:val="Hyperlink"/>
+          </w:rPr>
+          <w:t>Logo an</w:t>
+        </w:r>
+        <w:r>
+          <w:rPr>
+            <w:rStyle w:val="Hyperlink"/>
+          </w:rPr>
+          <w:t>d</w:t>
+        </w:r>
+        <w:r>
+          <w:rPr>
+            <w:rStyle w:val="Hyperlink"/>
+          </w:rPr>
+          <w:t xml:space="preserve"> brand</w:t>
+        </w:r>
+      </w:hyperlink>
+      <w:r>
+        <w:rPr>
+          <w:color w:val="000000"/>
+        </w:rPr>
+        <w:t xml:space="preserve"> · </w:t>
+      </w:r>
+      <w:hyperlink r:id="rId10" w:history="1">
+        <w:r>
+          <w:rPr>
+            <w:rStyle w:val="Hyperlink"/>
+          </w:rPr>
+          <w:t>Scre</w:t>
+        </w:r>
+        <w:r>
+          <w:rPr>
+            <w:rStyle w:val="Hyperlink"/>
+          </w:rPr>
+          <w:t>e</w:t>
+        </w:r>
+        <w:r>
+          <w:rPr>
+            <w:rStyle w:val="Hyperlink"/>
+          </w:rPr>
+          <w:t>n UI</w:t>
+        </w:r>
+      </w:hyperlink>
+    </w:p>
     <w:sectPr>
-      <w:headerReference w:type="even" r:id="rId9"/>
-      <w:headerReference w:type="default" r:id="rId10"/>
-      <w:footerReference w:type="even" r:id="rId11"/>
-      <w:footerReference w:type="default" r:id="rId12"/>
-      <w:headerReference w:type="first" r:id="rId13"/>
-      <w:footerReference w:type="first" r:id="rId14"/>
+      <w:headerReference w:type="even" r:id="rId11"/>
+      <w:headerReference w:type="default" r:id="rId12"/>
+      <w:footerReference w:type="even" r:id="rId13"/>
+      <w:footerReference w:type="default" r:id="rId14"/>
+      <w:headerReference w:type="first" r:id="rId15"/>
+      <w:footerReference w:type="first" r:id="rId16"/>
       <w:pgSz w:w="12240" w:h="15840"/>
       <w:pgMar w:top="1440" w:right="1440" w:bottom="1440" w:left="1440" w:header="720" w:footer="720" w:gutter="0"/>
       <w:cols w:space="720"/>
@@ -1822,7 +2006,6 @@
   <w:style w:type="character" w:default="1" w:styleId="DefaultParagraphFont">
     <w:name w:val="Default Paragraph Font"/>
     <w:uiPriority w:val="1"/>
-    <w:semiHidden/>
     <w:unhideWhenUsed/>
   </w:style>
   <w:style w:type="table" w:default="1" w:styleId="TableNormal">
@@ -2000,6 +2183,18 @@
     <w:rPr>
       <w:color w:val="96607D" w:themeColor="followedHyperlink"/>
       <w:u w:val="single"/>
+    </w:rPr>
+  </w:style>
+  <w:style w:type="character" w:styleId="UnresolvedMention">
+    <w:name w:val="Unresolved Mention"/>
+    <w:basedOn w:val="DefaultParagraphFont"/>
+    <w:uiPriority w:val="99"/>
+    <w:semiHidden/>
+    <w:unhideWhenUsed/>
+    <w:rsid w:val="00342554"/>
+    <w:rPr>
+      <w:color w:val="605E5C"/>
+      <w:shd w:val="clear" w:color="auto" w:fill="E1DFDD"/>
     </w:rPr>
   </w:style>
 </w:styles>

</xml_diff>